<commit_message>
Worked on cleaning the document:  - removing numbers and special chars  - removing stopwords, adding custom stopwords  - lemmatization  - word freq  - top word  - creating wordcloud
</commit_message>
<xml_diff>
--- a/one.docx
+++ b/one.docx
@@ -1,6 +1,6 @@
 
 <file path=word/document.xml><?xml version="1.0" encoding="utf-8"?>
-<w:document xmlns:wpc="http://schemas.microsoft.com/office/word/2010/wordprocessingCanvas" xmlns:cx="http://schemas.microsoft.com/office/drawing/2014/chartex" xmlns:cx1="http://schemas.microsoft.com/office/drawing/2015/9/8/chartex" xmlns:cx2="http://schemas.microsoft.com/office/drawing/2015/10/21/chartex" xmlns:cx3="http://schemas.microsoft.com/office/drawing/2016/5/9/chartex" xmlns:cx4="http://schemas.microsoft.com/office/drawing/2016/5/10/chartex" xmlns:cx5="http://schemas.microsoft.com/office/drawing/2016/5/11/chartex" xmlns:cx6="http://schemas.microsoft.com/office/drawing/2016/5/12/chartex" xmlns:cx7="http://schemas.microsoft.com/office/drawing/2016/5/13/chartex" xmlns:cx8="http://schemas.microsoft.com/office/drawing/2016/5/14/chartex" xmlns:mc="http://schemas.openxmlformats.org/markup-compatibility/2006" xmlns:aink="http://schemas.microsoft.com/office/drawing/2016/ink" xmlns:am3d="http://schemas.microsoft.com/office/drawing/2017/model3d" xmlns:o="urn:schemas-microsoft-com:office:office" xmlns:oel="http://schemas.microsoft.com/office/2019/extlst" xmlns:r="http://schemas.openxmlformats.org/officeDocument/2006/relationships" xmlns:m="http://schemas.openxmlformats.org/officeDocument/2006/math" xmlns:v="urn:schemas-microsoft-com:vml" xmlns:wp14="http://schemas.microsoft.com/office/word/2010/wordprocessingDrawing" xmlns:wp="http://schemas.openxmlformats.org/drawingml/2006/wordprocessingDrawing" xmlns:w10="urn:schemas-microsoft-com:office:word" xmlns:w="http://schemas.openxmlformats.org/wordprocessingml/2006/main" xmlns:w14="http://schemas.microsoft.com/office/word/2010/wordml" xmlns:w15="http://schemas.microsoft.com/office/word/2012/wordml" xmlns:w16cex="http://schemas.microsoft.com/office/word/2018/wordml/cex" xmlns:w16cid="http://schemas.microsoft.com/office/word/2016/wordml/cid" xmlns:w16="http://schemas.microsoft.com/office/word/2018/wordml" xmlns:w16sdtdh="http://schemas.microsoft.com/office/word/2020/wordml/sdtdatahash" xmlns:w16se="http://schemas.microsoft.com/office/word/2015/wordml/symex" xmlns:wpg="http://schemas.microsoft.com/office/word/2010/wordprocessingGroup" xmlns:wpi="http://schemas.microsoft.com/office/word/2010/wordprocessingInk" xmlns:wne="http://schemas.microsoft.com/office/word/2006/wordml" xmlns:wps="http://schemas.microsoft.com/office/word/2010/wordprocessingShape" mc:Ignorable="w14 w15 w16se w16cid w16 w16cex w16sdtdh wp14">
+<w:document xmlns:wpc="http://schemas.microsoft.com/office/word/2010/wordprocessingCanvas" xmlns:cx="http://schemas.microsoft.com/office/drawing/2014/chartex" xmlns:cx1="http://schemas.microsoft.com/office/drawing/2015/9/8/chartex" xmlns:cx2="http://schemas.microsoft.com/office/drawing/2015/10/21/chartex" xmlns:cx3="http://schemas.microsoft.com/office/drawing/2016/5/9/chartex" xmlns:cx4="http://schemas.microsoft.com/office/drawing/2016/5/10/chartex" xmlns:cx5="http://schemas.microsoft.com/office/drawing/2016/5/11/chartex" xmlns:cx6="http://schemas.microsoft.com/office/drawing/2016/5/12/chartex" xmlns:cx7="http://schemas.microsoft.com/office/drawing/2016/5/13/chartex" xmlns:cx8="http://schemas.microsoft.com/office/drawing/2016/5/14/chartex" xmlns:mc="http://schemas.openxmlformats.org/markup-compatibility/2006" xmlns:aink="http://schemas.microsoft.com/office/drawing/2016/ink" xmlns:am3d="http://schemas.microsoft.com/office/drawing/2017/model3d" xmlns:o="urn:schemas-microsoft-com:office:office" xmlns:oel="http://schemas.microsoft.com/office/2019/extlst" xmlns:r="http://schemas.openxmlformats.org/officeDocument/2006/relationships" xmlns:m="http://schemas.openxmlformats.org/officeDocument/2006/math" xmlns:v="urn:schemas-microsoft-com:vml" xmlns:wp14="http://schemas.microsoft.com/office/word/2010/wordprocessingDrawing" xmlns:wp="http://schemas.openxmlformats.org/drawingml/2006/wordprocessingDrawing" xmlns:w10="urn:schemas-microsoft-com:office:word" xmlns:w="http://schemas.openxmlformats.org/wordprocessingml/2006/main" xmlns:w14="http://schemas.microsoft.com/office/word/2010/wordml" xmlns:w15="http://schemas.microsoft.com/office/word/2012/wordml" xmlns:w16cex="http://schemas.microsoft.com/office/word/2018/wordml/cex" xmlns:w16cid="http://schemas.microsoft.com/office/word/2016/wordml/cid" xmlns:w16="http://schemas.microsoft.com/office/word/2018/wordml" xmlns:w16du="http://schemas.microsoft.com/office/word/2023/wordml/word16du" xmlns:w16sdtdh="http://schemas.microsoft.com/office/word/2020/wordml/sdtdatahash" xmlns:w16sdtfl="http://schemas.microsoft.com/office/word/2024/wordml/sdtformatlock" xmlns:w16se="http://schemas.microsoft.com/office/word/2015/wordml/symex" xmlns:wpg="http://schemas.microsoft.com/office/word/2010/wordprocessingGroup" xmlns:wpi="http://schemas.microsoft.com/office/word/2010/wordprocessingInk" xmlns:wne="http://schemas.microsoft.com/office/word/2006/wordml" xmlns:wps="http://schemas.microsoft.com/office/word/2010/wordprocessingShape" mc:Ignorable="w14 w15 w16se w16cid w16 w16cex w16sdtdh w16sdtfl w16du wp14">
   <w:body>
     <w:tbl>
       <w:tblPr>
@@ -177,33 +177,11 @@
           <w:lang w:val="sl-SI"/>
         </w:rPr>
       </w:pPr>
-      <w:proofErr w:type="spellStart"/>
       <w:r>
         <w:rPr>
           <w:lang w:val="sl-SI"/>
         </w:rPr>
-        <w:t>What</w:t>
-      </w:r>
-      <w:proofErr w:type="spellEnd"/>
-      <w:r>
-        <w:rPr>
-          <w:lang w:val="sl-SI"/>
-        </w:rPr>
-        <w:t xml:space="preserve"> is </w:t>
-      </w:r>
-      <w:proofErr w:type="spellStart"/>
-      <w:r>
-        <w:rPr>
-          <w:lang w:val="sl-SI"/>
-        </w:rPr>
-        <w:t>your</w:t>
-      </w:r>
-      <w:proofErr w:type="spellEnd"/>
-      <w:r>
-        <w:rPr>
-          <w:lang w:val="sl-SI"/>
-        </w:rPr>
-        <w:t xml:space="preserve"> name?</w:t>
+        <w:t>What is your name?</w:t>
       </w:r>
     </w:p>
     <w:p>
@@ -216,71 +194,7 @@
         <w:rPr>
           <w:lang w:val="sl-SI"/>
         </w:rPr>
-        <w:t xml:space="preserve">John </w:t>
-      </w:r>
-      <w:proofErr w:type="spellStart"/>
-      <w:r>
-        <w:rPr>
-          <w:lang w:val="sl-SI"/>
-        </w:rPr>
-        <w:t>Doe</w:t>
-      </w:r>
-      <w:proofErr w:type="spellEnd"/>
-    </w:p>
-    <w:p>
-      <w:pPr>
-        <w:rPr>
-          <w:lang w:val="sl-SI"/>
-        </w:rPr>
-      </w:pPr>
-    </w:p>
-    <w:p>
-      <w:pPr>
-        <w:rPr>
-          <w:lang w:val="sl-SI"/>
-        </w:rPr>
-      </w:pPr>
-      <w:proofErr w:type="spellStart"/>
-      <w:r>
-        <w:rPr>
-          <w:lang w:val="sl-SI"/>
-        </w:rPr>
-        <w:t>What</w:t>
-      </w:r>
-      <w:proofErr w:type="spellEnd"/>
-      <w:r>
-        <w:rPr>
-          <w:lang w:val="sl-SI"/>
-        </w:rPr>
-        <w:t xml:space="preserve"> is </w:t>
-      </w:r>
-      <w:proofErr w:type="spellStart"/>
-      <w:r>
-        <w:rPr>
-          <w:lang w:val="sl-SI"/>
-        </w:rPr>
-        <w:t>your</w:t>
-      </w:r>
-      <w:proofErr w:type="spellEnd"/>
-      <w:r>
-        <w:rPr>
-          <w:lang w:val="sl-SI"/>
-        </w:rPr>
-        <w:t xml:space="preserve"> </w:t>
-      </w:r>
-      <w:proofErr w:type="spellStart"/>
-      <w:r>
-        <w:rPr>
-          <w:lang w:val="sl-SI"/>
-        </w:rPr>
-        <w:t>occupation</w:t>
-      </w:r>
-      <w:proofErr w:type="spellEnd"/>
-      <w:r>
-        <w:rPr>
-          <w:lang w:val="sl-SI"/>
-        </w:rPr>
-        <w:t>?</w:t>
+        <w:t>John Doe</w:t>
       </w:r>
     </w:p>
     <w:p>
@@ -289,14 +203,32 @@
           <w:lang w:val="sl-SI"/>
         </w:rPr>
       </w:pPr>
-      <w:proofErr w:type="spellStart"/>
+    </w:p>
+    <w:p>
+      <w:pPr>
+        <w:rPr>
+          <w:lang w:val="sl-SI"/>
+        </w:rPr>
+      </w:pPr>
+      <w:r>
+        <w:rPr>
+          <w:lang w:val="sl-SI"/>
+        </w:rPr>
+        <w:t>What is your occupation?</w:t>
+      </w:r>
+    </w:p>
+    <w:p>
+      <w:pPr>
+        <w:rPr>
+          <w:lang w:val="sl-SI"/>
+        </w:rPr>
+      </w:pPr>
       <w:r>
         <w:rPr>
           <w:lang w:val="sl-SI"/>
         </w:rPr>
         <w:t>Carpenter</w:t>
       </w:r>
-      <w:proofErr w:type="spellEnd"/>
     </w:p>
     <w:p>
       <w:pPr>
@@ -311,14 +243,57 @@
           <w:lang w:val="sl-SI"/>
         </w:rPr>
       </w:pPr>
-      <w:proofErr w:type="spellStart"/>
       <w:r>
         <w:rPr>
           <w:lang w:val="sl-SI"/>
         </w:rPr>
         <w:t>Birthday</w:t>
       </w:r>
-      <w:proofErr w:type="spellEnd"/>
+    </w:p>
+    <w:p>
+      <w:pPr>
+        <w:rPr>
+          <w:lang w:val="sl-SI"/>
+        </w:rPr>
+      </w:pPr>
+      <w:r>
+        <w:rPr>
+          <w:lang w:val="sl-SI"/>
+        </w:rPr>
+        <w:t>O</w:t>
+      </w:r>
+      <w:r>
+        <w:rPr>
+          <w:lang w:val="sl-SI"/>
+        </w:rPr>
+        <w:t>ccupation</w:t>
+      </w:r>
+    </w:p>
+    <w:p>
+      <w:pPr>
+        <w:rPr>
+          <w:lang w:val="sl-SI"/>
+        </w:rPr>
+      </w:pPr>
+      <w:r>
+        <w:rPr>
+          <w:lang w:val="sl-SI"/>
+        </w:rPr>
+        <w:t>Occupation</w:t>
+      </w:r>
+      <w:r>
+        <w:rPr>
+          <w:lang w:val="sl-SI"/>
+        </w:rPr>
+        <w:t>s</w:t>
+      </w:r>
+    </w:p>
+    <w:p>
+      <w:pPr>
+        <w:rPr>
+          <w:lang w:val="sl-SI"/>
+        </w:rPr>
+      </w:pPr>
     </w:p>
     <w:p>
       <w:pPr>
@@ -344,14 +319,14 @@
 </file>
 
 <file path=word/styles.xml><?xml version="1.0" encoding="utf-8"?>
-<w:styles xmlns:mc="http://schemas.openxmlformats.org/markup-compatibility/2006" xmlns:r="http://schemas.openxmlformats.org/officeDocument/2006/relationships" xmlns:w="http://schemas.openxmlformats.org/wordprocessingml/2006/main" xmlns:w14="http://schemas.microsoft.com/office/word/2010/wordml" xmlns:w15="http://schemas.microsoft.com/office/word/2012/wordml" xmlns:w16cex="http://schemas.microsoft.com/office/word/2018/wordml/cex" xmlns:w16cid="http://schemas.microsoft.com/office/word/2016/wordml/cid" xmlns:w16="http://schemas.microsoft.com/office/word/2018/wordml" xmlns:w16sdtdh="http://schemas.microsoft.com/office/word/2020/wordml/sdtdatahash" xmlns:w16se="http://schemas.microsoft.com/office/word/2015/wordml/symex" mc:Ignorable="w14 w15 w16se w16cid w16 w16cex w16sdtdh">
+<w:styles xmlns:mc="http://schemas.openxmlformats.org/markup-compatibility/2006" xmlns:r="http://schemas.openxmlformats.org/officeDocument/2006/relationships" xmlns:w="http://schemas.openxmlformats.org/wordprocessingml/2006/main" xmlns:w14="http://schemas.microsoft.com/office/word/2010/wordml" xmlns:w15="http://schemas.microsoft.com/office/word/2012/wordml" xmlns:w16cex="http://schemas.microsoft.com/office/word/2018/wordml/cex" xmlns:w16cid="http://schemas.microsoft.com/office/word/2016/wordml/cid" xmlns:w16="http://schemas.microsoft.com/office/word/2018/wordml" xmlns:w16du="http://schemas.microsoft.com/office/word/2023/wordml/word16du" xmlns:w16sdtdh="http://schemas.microsoft.com/office/word/2020/wordml/sdtdatahash" xmlns:w16sdtfl="http://schemas.microsoft.com/office/word/2024/wordml/sdtformatlock" xmlns:w16se="http://schemas.microsoft.com/office/word/2015/wordml/symex" mc:Ignorable="w14 w15 w16se w16cid w16 w16cex w16sdtdh w16sdtfl w16du">
   <w:docDefaults>
     <w:rPrDefault>
       <w:rPr>
         <w:rFonts w:asciiTheme="minorHAnsi" w:eastAsiaTheme="minorHAnsi" w:hAnsiTheme="minorHAnsi" w:cstheme="minorBidi"/>
         <w:sz w:val="22"/>
         <w:szCs w:val="22"/>
-        <w:lang w:val="en-SI" w:eastAsia="en-US" w:bidi="ar-SA"/>
+        <w:lang w:eastAsia="en-US" w:bidi="ar-SA"/>
       </w:rPr>
     </w:rPrDefault>
     <w:pPrDefault>
@@ -745,7 +720,6 @@
   <w:style w:type="character" w:default="1" w:styleId="DefaultParagraphFont">
     <w:name w:val="Default Paragraph Font"/>
     <w:uiPriority w:val="1"/>
-    <w:semiHidden/>
     <w:unhideWhenUsed/>
   </w:style>
   <w:style w:type="table" w:default="1" w:styleId="TableNormal">

</xml_diff>